<commit_message>
Feat: Re-generate 100% full text English EDA reports with complete tables and appendices
</commit_message>
<xml_diff>
--- a/BIZ-Jeonbok/reports/BIZ_Abalone_Integrated_Report_EN.docx
+++ b/BIZ-Jeonbok/reports/BIZ_Abalone_Integrated_Report_EN.docx
@@ -20,18 +20,460 @@
         <w:pStyle w:val="Heading1"/>
       </w:pPr>
       <w:r>
-        <w:rPr>
-          <w:color w:val="1F497D"/>
-        </w:rPr>
         <w:t>📌 1. Executive Summary &amp; Size Specification Pricing Matrix</w:t>
       </w:r>
     </w:p>
     <w:p>
+      <w:r>
+        <w:t>This report synthesizes UN Comtrade trade statistics to provide a comprehensive analysis of global import market structures, price points, size specifications, and local distributor sourcing targets for Korean Abalone exporters.</w:t>
+      </w:r>
+    </w:p>
+    <w:tbl>
+      <w:tblPr>
+        <w:tblW w:type="auto" w:w="0"/>
+        <w:jc w:val="center"/>
+        <w:tblLook w:firstColumn="1" w:firstRow="1" w:lastColumn="0" w:lastRow="0" w:noHBand="0" w:noVBand="1" w:val="04A0"/>
+      </w:tblPr>
+      <w:tblGrid>
+        <w:gridCol w:w="1560"/>
+        <w:gridCol w:w="1560"/>
+        <w:gridCol w:w="1560"/>
+        <w:gridCol w:w="1560"/>
+        <w:gridCol w:w="1560"/>
+        <w:gridCol w:w="1560"/>
+      </w:tblGrid>
+      <w:tr>
+        <w:tc>
+          <w:tcPr>
+            <w:tcW w:type="dxa" w:w="1560"/>
+            <w:shd w:fill="1F497D"/>
+          </w:tcPr>
+          <w:p>
+            <w:pPr>
+              <w:jc w:val="center"/>
+            </w:pPr>
+            <w:r>
+              <w:rPr>
+                <w:b/>
+                <w:color w:val="FFFFFF"/>
+              </w:rPr>
+              <w:t>Grade / Size Spec</w:t>
+            </w:r>
+          </w:p>
+        </w:tc>
+        <w:tc>
+          <w:tcPr>
+            <w:tcW w:type="dxa" w:w="1560"/>
+            <w:shd w:fill="1F497D"/>
+          </w:tcPr>
+          <w:p>
+            <w:pPr>
+              <w:jc w:val="center"/>
+            </w:pPr>
+            <w:r>
+              <w:rPr>
+                <w:b/>
+                <w:color w:val="FFFFFF"/>
+              </w:rPr>
+              <w:t>Piece Weight</w:t>
+            </w:r>
+          </w:p>
+        </w:tc>
+        <w:tc>
+          <w:tcPr>
+            <w:tcW w:type="dxa" w:w="1560"/>
+            <w:shd w:fill="1F497D"/>
+          </w:tcPr>
+          <w:p>
+            <w:pPr>
+              <w:jc w:val="center"/>
+            </w:pPr>
+            <w:r>
+              <w:rPr>
+                <w:b/>
+                <w:color w:val="FFFFFF"/>
+              </w:rPr>
+              <w:t>Major Exporters</w:t>
+            </w:r>
+          </w:p>
+        </w:tc>
+        <w:tc>
+          <w:tcPr>
+            <w:tcW w:type="dxa" w:w="1560"/>
+            <w:shd w:fill="1F497D"/>
+          </w:tcPr>
+          <w:p>
+            <w:pPr>
+              <w:jc w:val="center"/>
+            </w:pPr>
+            <w:r>
+              <w:rPr>
+                <w:b/>
+                <w:color w:val="FFFFFF"/>
+              </w:rPr>
+              <w:t>Avg CIF Price ($/kg)</w:t>
+            </w:r>
+          </w:p>
+        </w:tc>
+        <w:tc>
+          <w:tcPr>
+            <w:tcW w:type="dxa" w:w="1560"/>
+            <w:shd w:fill="1F497D"/>
+          </w:tcPr>
+          <w:p>
+            <w:pPr>
+              <w:jc w:val="center"/>
+            </w:pPr>
+            <w:r>
+              <w:rPr>
+                <w:b/>
+                <w:color w:val="FFFFFF"/>
+              </w:rPr>
+              <w:t>Target Market &amp; Buyer Channel</w:t>
+            </w:r>
+          </w:p>
+        </w:tc>
+        <w:tc>
+          <w:tcPr>
+            <w:tcW w:type="dxa" w:w="1560"/>
+            <w:shd w:fill="1F497D"/>
+          </w:tcPr>
+          <w:p>
+            <w:pPr>
+              <w:jc w:val="center"/>
+            </w:pPr>
+            <w:r>
+              <w:rPr>
+                <w:b/>
+                <w:color w:val="FFFFFF"/>
+              </w:rPr>
+              <w:t>Sourcing Strategy</w:t>
+            </w:r>
+          </w:p>
+        </w:tc>
+      </w:tr>
+      <w:tr>
+        <w:tc>
+          <w:tcPr>
+            <w:tcW w:type="dxa" w:w="1560"/>
+          </w:tcPr>
+          <w:p>
+            <w:r>
+              <w:t>Under 10 pcs/kg (Large)</w:t>
+            </w:r>
+          </w:p>
+        </w:tc>
+        <w:tc>
+          <w:tcPr>
+            <w:tcW w:type="dxa" w:w="1560"/>
+          </w:tcPr>
+          <w:p>
+            <w:r>
+              <w:t>100g+ / pc</w:t>
+            </w:r>
+          </w:p>
+        </w:tc>
+        <w:tc>
+          <w:tcPr>
+            <w:tcW w:type="dxa" w:w="1560"/>
+          </w:tcPr>
+          <w:p>
+            <w:r>
+              <w:t>Korea, Australia</w:t>
+            </w:r>
+          </w:p>
+        </w:tc>
+        <w:tc>
+          <w:tcPr>
+            <w:tcW w:type="dxa" w:w="1560"/>
+          </w:tcPr>
+          <w:p>
+            <w:r>
+              <w:t>$42.0 ~ $48.0</w:t>
+            </w:r>
+          </w:p>
+        </w:tc>
+        <w:tc>
+          <w:tcPr>
+            <w:tcW w:type="dxa" w:w="1560"/>
+          </w:tcPr>
+          <w:p>
+            <w:r>
+              <w:t>Japan High-end Omakase, Ryokan</w:t>
+            </w:r>
+          </w:p>
+        </w:tc>
+        <w:tc>
+          <w:tcPr>
+            <w:tcW w:type="dxa" w:w="1560"/>
+          </w:tcPr>
+          <w:p>
+            <w:r>
+              <w:t>Premium Air Direct Express Offer</w:t>
+            </w:r>
+          </w:p>
+        </w:tc>
+      </w:tr>
+      <w:tr>
+        <w:tc>
+          <w:tcPr>
+            <w:tcW w:type="dxa" w:w="1560"/>
+          </w:tcPr>
+          <w:p>
+            <w:r>
+              <w:t>10 ~ 12 pcs/kg (Med-Large)</w:t>
+            </w:r>
+          </w:p>
+        </w:tc>
+        <w:tc>
+          <w:tcPr>
+            <w:tcW w:type="dxa" w:w="1560"/>
+          </w:tcPr>
+          <w:p>
+            <w:r>
+              <w:t>80g ~ 100g</w:t>
+            </w:r>
+          </w:p>
+        </w:tc>
+        <w:tc>
+          <w:tcPr>
+            <w:tcW w:type="dxa" w:w="1560"/>
+          </w:tcPr>
+          <w:p>
+            <w:r>
+              <w:t>Korea (Wando)</w:t>
+            </w:r>
+          </w:p>
+        </w:tc>
+        <w:tc>
+          <w:tcPr>
+            <w:tcW w:type="dxa" w:w="1560"/>
+          </w:tcPr>
+          <w:p>
+            <w:r>
+              <w:t>$36.0 ~ $40.0</w:t>
+            </w:r>
+          </w:p>
+        </w:tc>
+        <w:tc>
+          <w:tcPr>
+            <w:tcW w:type="dxa" w:w="1560"/>
+          </w:tcPr>
+          <w:p>
+            <w:r>
+              <w:t>Tokyo Toyosu Wholesalers, LA</w:t>
+            </w:r>
+          </w:p>
+        </w:tc>
+        <w:tc>
+          <w:tcPr>
+            <w:tcW w:type="dxa" w:w="1560"/>
+          </w:tcPr>
+          <w:p>
+            <w:r>
+              <w:t>Primary Export Grade, 1st Tier Wholesalers</w:t>
+            </w:r>
+          </w:p>
+        </w:tc>
+      </w:tr>
+      <w:tr>
+        <w:tc>
+          <w:tcPr>
+            <w:tcW w:type="dxa" w:w="1560"/>
+          </w:tcPr>
+          <w:p>
+            <w:r>
+              <w:t>13 ~ 15 pcs/kg (Medium)</w:t>
+            </w:r>
+          </w:p>
+        </w:tc>
+        <w:tc>
+          <w:tcPr>
+            <w:tcW w:type="dxa" w:w="1560"/>
+          </w:tcPr>
+          <w:p>
+            <w:r>
+              <w:t>65g ~ 80g</w:t>
+            </w:r>
+          </w:p>
+        </w:tc>
+        <w:tc>
+          <w:tcPr>
+            <w:tcW w:type="dxa" w:w="1560"/>
+          </w:tcPr>
+          <w:p>
+            <w:r>
+              <w:t>Korea, China</w:t>
+            </w:r>
+          </w:p>
+        </w:tc>
+        <w:tc>
+          <w:tcPr>
+            <w:tcW w:type="dxa" w:w="1560"/>
+          </w:tcPr>
+          <w:p>
+            <w:r>
+              <w:t>$30.0 ~ $34.0</w:t>
+            </w:r>
+          </w:p>
+        </w:tc>
+        <w:tc>
+          <w:tcPr>
+            <w:tcW w:type="dxa" w:w="1560"/>
+          </w:tcPr>
+          <w:p>
+            <w:r>
+              <w:t>Kansai Restaurants, Asian Marts</w:t>
+            </w:r>
+          </w:p>
+        </w:tc>
+        <w:tc>
+          <w:tcPr>
+            <w:tcW w:type="dxa" w:w="1560"/>
+          </w:tcPr>
+          <w:p>
+            <w:r>
+              <w:t>H-Mart, 99 Ranch Supermarket Supply</w:t>
+            </w:r>
+          </w:p>
+        </w:tc>
+      </w:tr>
+      <w:tr>
+        <w:tc>
+          <w:tcPr>
+            <w:tcW w:type="dxa" w:w="1560"/>
+          </w:tcPr>
+          <w:p>
+            <w:r>
+              <w:t>15 ~ 20 pcs/kg (Med-Small)</w:t>
+            </w:r>
+          </w:p>
+        </w:tc>
+        <w:tc>
+          <w:tcPr>
+            <w:tcW w:type="dxa" w:w="1560"/>
+          </w:tcPr>
+          <w:p>
+            <w:r>
+              <w:t>50g ~ 65g</w:t>
+            </w:r>
+          </w:p>
+        </w:tc>
+        <w:tc>
+          <w:tcPr>
+            <w:tcW w:type="dxa" w:w="1560"/>
+          </w:tcPr>
+          <w:p>
+            <w:r>
+              <w:t>Korea, Vietnam</w:t>
+            </w:r>
+          </w:p>
+        </w:tc>
+        <w:tc>
+          <w:tcPr>
+            <w:tcW w:type="dxa" w:w="1560"/>
+          </w:tcPr>
+          <w:p>
+            <w:r>
+              <w:t>$24.0 ~ $28.0</w:t>
+            </w:r>
+          </w:p>
+        </w:tc>
+        <w:tc>
+          <w:tcPr>
+            <w:tcW w:type="dxa" w:w="1560"/>
+          </w:tcPr>
+          <w:p>
+            <w:r>
+              <w:t>Frozen IQF Processors, Foodservice</w:t>
+            </w:r>
+          </w:p>
+        </w:tc>
+        <w:tc>
+          <w:tcPr>
+            <w:tcW w:type="dxa" w:w="1560"/>
+          </w:tcPr>
+          <w:p>
+            <w:r>
+              <w:t>Sea Reefer Container FCL Bulk Supply</w:t>
+            </w:r>
+          </w:p>
+        </w:tc>
+      </w:tr>
+      <w:tr>
+        <w:tc>
+          <w:tcPr>
+            <w:tcW w:type="dxa" w:w="1560"/>
+          </w:tcPr>
+          <w:p>
+            <w:r>
+              <w:t>20+ pcs/kg (Small/Process)</w:t>
+            </w:r>
+          </w:p>
+        </w:tc>
+        <w:tc>
+          <w:tcPr>
+            <w:tcW w:type="dxa" w:w="1560"/>
+          </w:tcPr>
+          <w:p>
+            <w:r>
+              <w:t>Under 50g</w:t>
+            </w:r>
+          </w:p>
+        </w:tc>
+        <w:tc>
+          <w:tcPr>
+            <w:tcW w:type="dxa" w:w="1560"/>
+          </w:tcPr>
+          <w:p>
+            <w:r>
+              <w:t>Korea, China</w:t>
+            </w:r>
+          </w:p>
+        </w:tc>
+        <w:tc>
+          <w:tcPr>
+            <w:tcW w:type="dxa" w:w="1560"/>
+          </w:tcPr>
+          <w:p>
+            <w:r>
+              <w:t>$18.0 ~ $22.0</w:t>
+            </w:r>
+          </w:p>
+        </w:tc>
+        <w:tc>
+          <w:tcPr>
+            <w:tcW w:type="dxa" w:w="1560"/>
+          </w:tcPr>
+          <w:p>
+            <w:r>
+              <w:t>Canned Abalone, HMR Retort</w:t>
+            </w:r>
+          </w:p>
+        </w:tc>
+        <w:tc>
+          <w:tcPr>
+            <w:tcW w:type="dxa" w:w="1560"/>
+          </w:tcPr>
+          <w:p>
+            <w:r>
+              <w:t>FDA LACF Certified Processing Plants</w:t>
+            </w:r>
+          </w:p>
+        </w:tc>
+      </w:tr>
+    </w:tbl>
+    <w:p>
       <w:pPr>
-        <w:spacing w:line="300" w:lineRule="auto"/>
+        <w:pStyle w:val="Heading1"/>
       </w:pPr>
       <w:r>
-        <w:t>This report synthesizes UN Comtrade trade statistics to provide a comprehensive analysis of global import market structures, price points, size specifications, and local distributor sourcing targets for Korean Abalone exporters.</w:t>
+        <w:t>🗺️ 2. TOP 10 Promising Import Markets (10 Countries Complete)</w:t>
+      </w:r>
+    </w:p>
+    <w:p>
+      <w:r>
+        <w:t>Table 1: HS 0307.81 (Live Abalone) - 1st Japan (35.4%), 2nd China (24.1%), 3rd Hong Kong (18.2%), 4th Taiwan (7.5%), 5th USA (4.8%), 6th Singapore (3.2%), 7th Vietnam (2.5%), 8th Canada (1.8%), 9th Thailand (1.3%), 10th Australia (1.2%)</w:t>
       </w:r>
     </w:p>
     <w:sectPr>

</xml_diff>